<commit_message>
Referencias: uso de cada cita verificado contra el informe, la bitacora y el codigo; datos bibliograficos contra Crossref
Co-Authored-By: Claude Opus 5.5 <noreply@anthropic.com>
</commit_message>
<xml_diff>
--- a/docs/Referencias_Augur_paper.docx
+++ b/docs/Referencias_Augur_paper.docx
@@ -152,7 +152,7 @@
         <w:rPr>
           <w:sz w:val="19"/>
         </w:rPr>
-        <w:t>Revisión de base del área (EPF). Marco general del problema.</w:t>
+        <w:t>En el informe: las series de precio eléctrico tienen saltos, estacionalidad múltiple y cambios de régimen, y las tres familias de métodos de pronóstico (estadísticos, aprendizaje automático y redes profundas).</w:t>
       </w:r>
     </w:p>
     <w:p>
@@ -199,7 +199,7 @@
         <w:rPr>
           <w:sz w:val="19"/>
         </w:rPr>
-        <w:t>Define el LEAR (un LASSO por hora) y las buenas prácticas de evaluación: Diebold-Mariano, rMAE contra persistencia, protocolo day-ahead. Respalda el rMAE mensual y la persistencia de 7 días.</w:t>
+        <w:t>Define el LEAR (un LASSO por hora) y las buenas prácticas de evaluación: Diebold-Mariano, rMAE contra persistencia, protocolo day-ahead. En el informe fija el criterio de precisión (rMAE &lt; 1 frente a la persistencia, Tabla de requerimientos) y es el referente de buenas prácticas. Respalda el rMAE mensual y la persistencia de 7 días.</w:t>
       </w:r>
     </w:p>
     <w:p>
@@ -246,7 +246,7 @@
         <w:rPr>
           <w:sz w:val="19"/>
         </w:rPr>
-        <w:t>Explica el salto de medianoche: las 24 horas de un día salen de una sola subasta. Marco multivariante.</w:t>
+        <w:t>Explica el salto de medianoche: las 24 horas de un día salen de una sola subasta (bitácora del 18-sep). En el informe se cita junto a Kapoor y Wichitaksorn para decir que los modelos simples compiten con el aprendizaje profundo; ese uso conviene revisarlo, porque el paper compara marcos univariados y multivariados, no modelos simples contra redes profundas.</w:t>
       </w:r>
     </w:p>
     <w:p>
@@ -293,7 +293,7 @@
         <w:rPr>
           <w:sz w:val="19"/>
         </w:rPr>
-        <w:t>QRA: el combinador del modelo en producción (predespacho + 3 CatBoost, por bloques de 6 h) y sus cuantiles.</w:t>
+        <w:t>QRA: combinador del modelo en producción (pesos no negativos e intercepto por franja de 6 h para el predespacho y el promedio de los tres CatBoost, objetivo MAE) y del ensamble anterior de seis votantes. En el informe también respalda el paso al pronóstico probabilístico.</w:t>
       </w:r>
     </w:p>
     <w:p>
@@ -340,7 +340,7 @@
         <w:rPr>
           <w:sz w:val="19"/>
         </w:rPr>
-        <w:t>Algoritmo de los tres modelos de corrección del predespacho en producción.</w:t>
+        <w:t>Algoritmo de los tres modelos de producción, que corrigen el predespacho: pronostican log(precio/predespacho) con pérdida MAE (1.500 árboles, profundidad 6, tasa 0,05).</w:t>
       </w:r>
     </w:p>
     <w:p>
@@ -387,7 +387,7 @@
         <w:rPr>
           <w:sz w:val="19"/>
         </w:rPr>
-        <w:t>Modelo de la primera etapa y uno de los comparados en el benchmark del escenario realista.</w:t>
+        <w:t>Votante del ensamble de la primera etapa (notebook 06) y uno de los modelos del benchmark del escenario realista. En el informe final figura en la lista de referencias pero no se cita en el texto.</w:t>
       </w:r>
     </w:p>
     <w:p>
@@ -481,7 +481,7 @@
         <w:rPr>
           <w:sz w:val="19"/>
         </w:rPr>
-        <w:t>Random Forest en el benchmark del escenario realista; también origen de la importancia por permutación.</w:t>
+        <w:t>Random Forest en el benchmark del escenario realista (realista_benchmark_modelos.py) y origen de la importancia por permutación del notebook 06.</w:t>
       </w:r>
     </w:p>
     <w:p>
@@ -528,7 +528,7 @@
         <w:rPr>
           <w:sz w:val="19"/>
         </w:rPr>
-        <w:t>LASSO del LEAR y del Lasso del benchmark.</w:t>
+        <w:t>En el informe: la regularización LASSO en la revisión del estado del arte. En el código: el LEAR (lear_24h.py) y el Lasso del benchmark, que pierde en 3 de 6 periodos.</w:t>
       </w:r>
     </w:p>
     <w:p>
@@ -575,7 +575,7 @@
         <w:rPr>
           <w:sz w:val="19"/>
         </w:rPr>
-        <w:t>N-BEATSx, votante del ensamble de la primera etapa (notebook 09).</w:t>
+        <w:t>N-BEATSx, votante del ensamble de la primera etapa (notebook 09). En el informe final figura en la lista de referencias pero no se cita en el texto.</w:t>
       </w:r>
     </w:p>
     <w:p>
@@ -622,7 +622,7 @@
         <w:rPr>
           <w:sz w:val="19"/>
         </w:rPr>
-        <w:t>N-HiTS, votante del ensamble de la primera etapa.</w:t>
+        <w:t>N-HiTS, votante del ensamble de la primera etapa (notebook 09). En el informe final figura en la lista de referencias pero no se cita en el texto.</w:t>
       </w:r>
     </w:p>
     <w:p>
@@ -716,7 +716,7 @@
         <w:rPr>
           <w:sz w:val="19"/>
         </w:rPr>
-        <w:t>ARX+GARCH(1,1) (notebook 08).</w:t>
+        <w:t>ARX+GARCH(1,1) (notebook 08). En el informe final figura en la lista de referencias pero no se cita en el texto.</w:t>
       </w:r>
     </w:p>
     <w:p>
@@ -763,7 +763,7 @@
         <w:rPr>
           <w:sz w:val="19"/>
         </w:rPr>
-        <w:t>GARCH con distribución GED y variantes asimétricas probadas como votante.</w:t>
+        <w:t>EGARCH: variantes asimétricas de GARCH probadas como votante (pronósticos EGARCH-t y EGARCH-skewt). En el informe final figura en la lista de referencias pero no se cita en el texto.</w:t>
       </w:r>
     </w:p>
     <w:p>
@@ -873,11 +873,11 @@
           <w:b/>
           <w:color w:val="B45309"/>
         </w:rPr>
-        <w:t>[V]</w:t>
+        <w:t>[L]</w:t>
         <w:tab/>
       </w:r>
       <w:r>
-        <w:t>B. Uniejewski, artículo sobre asinh parametrizado y promediado AVGroll, Electr. Power Syst. Res., vol. 257, 2026.</w:t>
+        <w:t>B. Uniejewski, "Variance stabilizing transformations for electricity price forecasting in periods of increased volatility," Electr. Power Syst. Res., vol. 257, art. 112992, 2026.</w:t>
       </w:r>
     </w:p>
     <w:p>
@@ -890,7 +890,7 @@
           <w:color w:val="555555"/>
           <w:sz w:val="18"/>
         </w:rPr>
-        <w:t>Título exacto por verificar</w:t>
+        <w:t>doi: 10.1016/j.epsr.2026.112992</w:t>
         <w:br/>
       </w:r>
       <w:r>
@@ -904,7 +904,7 @@
         <w:rPr>
           <w:sz w:val="19"/>
         </w:rPr>
-        <w:t>AVGroll y combinación por hora del día; inspiró aplicar el QRA por franja. Mejora de solo 0,7 %.</w:t>
+        <w:t>asinh parametrizado con promediado AVGroll sobre el Ridge directo: mejora de solo 0,7 %. Su combinación por hora del día inspiró aplicar el combinador por franja.</w:t>
       </w:r>
     </w:p>
     <w:p>
@@ -1006,7 +1006,7 @@
         <w:rPr>
           <w:sz w:val="19"/>
         </w:rPr>
-        <w:t>Prueba DM usada para aceptar o rechazar cada cambio (benchmark, walk-forward, curva50, detector de 72 h).</w:t>
+        <w:t>Prueba DM: en el informe, criterio de aceptación (p &lt; 0,05) y comparación con los antecedentes; en los experimentos, para aceptar o rechazar cada cambio (benchmark, walk-forward, curva50, detector de 72 h).</w:t>
       </w:r>
     </w:p>
     <w:p>
@@ -1053,7 +1053,7 @@
         <w:rPr>
           <w:sz w:val="19"/>
         </w:rPr>
-        <w:t>Varianza HAC en la prueba DM (errores horarios autocorrelacionados).</w:t>
+        <w:t>Varianza HAC de Newey-West en la prueba DM, porque los errores horarios están autocorrelacionados.</w:t>
       </w:r>
     </w:p>
     <w:p>
@@ -1100,7 +1100,7 @@
         <w:rPr>
           <w:sz w:val="19"/>
         </w:rPr>
-        <w:t>Validación walk-forward por orígenes (6 orígenes ENSO y walk-forward realista).</w:t>
+        <w:t>Evaluación fuera de muestra con origen móvil (walk-forward): criterio de robustez del informe (rMAE &lt; 1 en todos los meses) y los 6 orígenes ENSO y el walk-forward realista.</w:t>
       </w:r>
     </w:p>
     <w:p>
@@ -1147,7 +1147,7 @@
         <w:rPr>
           <w:sz w:val="19"/>
         </w:rPr>
-        <w:t>MASE y escalado contra la persistencia.</w:t>
+        <w:t>Métricas adimensionales (MASE, error relativo a la persistencia) del criterio de precisión del informe.</w:t>
       </w:r>
     </w:p>
     <w:p>
@@ -1194,7 +1194,7 @@
         <w:rPr>
           <w:sz w:val="19"/>
         </w:rPr>
-        <w:t>Métricas de forma del día (Corr-f, MHD, MPD) y evaluación económica del motor de decisión.</w:t>
+        <w:t>En el informe: un menor error no garantiza mejores decisiones de mercado, y la traducción a pesos no sustituye una evaluación económica completa. En el código: métricas de forma del día (Corr-f, MHD, MPD; metricas_forma_2026.py).</w:t>
       </w:r>
     </w:p>
     <w:p>
@@ -1241,7 +1241,7 @@
         <w:rPr>
           <w:sz w:val="19"/>
         </w:rPr>
-        <w:t>Bandas conformes sobre los cuantiles del QRA (q10-q90).</w:t>
+        <w:t>Inferencia conforme de las bandas [q10, q90]: q10 y q90 = q50·exp(∓m), con m el cuantil conforme de |log(y/q50)| de la misma hora en los 60 días anteriores ya publicados. También fija el criterio de cobertura (80 ± 5 %).</w:t>
       </w:r>
     </w:p>
     <w:p>
@@ -1288,7 +1288,7 @@
         <w:rPr>
           <w:sz w:val="19"/>
         </w:rPr>
-        <w:t>Fundamento de la predicción conforme.</w:t>
+        <w:t>Fundamento de la predicción conforme; en el informe, junto a Romano et al., para las bandas por grupos (hora).</w:t>
       </w:r>
     </w:p>
     <w:p>
@@ -1335,7 +1335,7 @@
         <w:rPr>
           <w:sz w:val="19"/>
         </w:rPr>
-        <w:t>Respaldo de la calibración conforme adaptativa y causal que usan las bandas.</w:t>
+        <w:t>Respaldo de la calibración conforme con ventana móvil de 60 días, que se adapta a cambios de distribución.</w:t>
       </w:r>
     </w:p>
     <w:p>
@@ -1492,11 +1492,11 @@
           <w:b/>
           <w:color w:val="B45309"/>
         </w:rPr>
-        <w:t>[L]</w:t>
+        <w:t>[S]</w:t>
         <w:tab/>
       </w:r>
       <w:r>
-        <w:t>H. Hewamalage, K. Ackermann y C. Bergmeir, "Forecast evaluation for data scientists: Common pitfalls and best practices," Data Min. Knowl. Discov., vol. 37, pp. 788–832, 2023.</w:t>
+        <w:t>H. Hewamalage, K. Ackermann y C. Bergmeir, "Forecast evaluation for data scientists: Common pitfalls and best practices," Data Min. Knowl. Discov., vol. 37, no. 2, pp. 788–832, 2023.</w:t>
       </w:r>
     </w:p>
     <w:p>
@@ -1523,7 +1523,7 @@
         <w:rPr>
           <w:sz w:val="19"/>
         </w:rPr>
-        <w:t>Citado por Albani et al.; respalda que los modelos complejos no siempre ganan de forma significativa.</w:t>
+        <w:t>Conocido a través de Albani et al. (no se leyó el original): respalda que los modelos complejos no siempre ganan de forma significativa.</w:t>
       </w:r>
     </w:p>
     <w:p>
@@ -1570,7 +1570,7 @@
         <w:rPr>
           <w:sz w:val="19"/>
         </w:rPr>
-        <w:t>SHAP sobre XGBoost (notebook 06).</w:t>
+        <w:t>SHAP sobre XGBoost (notebook 06): coincide con la importancia por permutación en las tres variables principales (Spearman 0,811).</w:t>
       </w:r>
     </w:p>
     <w:p>
@@ -1664,7 +1664,7 @@
         <w:rPr>
           <w:sz w:val="19"/>
         </w:rPr>
-        <w:t>Análisis exploratorio y criterio de valores atípicos de la caracterización.</w:t>
+        <w:t>Rango intercuartílico: justifica los percentiles 25 y 75 como umbrales por defecto del motor.</w:t>
       </w:r>
     </w:p>
     <w:p>
@@ -1727,11 +1727,11 @@
           <w:b/>
           <w:color w:val="B45309"/>
         </w:rPr>
-        <w:t>[V]</w:t>
+        <w:t>[L]</w:t>
         <w:tab/>
       </w:r>
       <w:r>
-        <w:t>Emre (2025), artículo de International Journal of Electrical Power &amp; Energy Systems con metodología de causalidad de Granger.</w:t>
+        <w:t>T. Emre, "The influence of hydroelectric power generation and water level variability on market clearing prices: A case study of Türkiye," Int. J. Electr. Power Energy Syst., vol. 170, art. 110865, 2025.</w:t>
       </w:r>
     </w:p>
     <w:p>
@@ -1744,7 +1744,7 @@
           <w:color w:val="555555"/>
           <w:sz w:val="18"/>
         </w:rPr>
-        <w:t>Datos completos por verificar</w:t>
+        <w:t>doi: 10.1016/j.ijepes.2025.110865</w:t>
         <w:br/>
       </w:r>
       <w:r>
@@ -1786,7 +1786,7 @@
         <w:tab/>
       </w:r>
       <w:r>
-        <w:t>J. Nasiadka, W. Nitka y R. Weron, "Calibration window selection based on change-point detection for forecasting electricity prices," en Computational Science – ICCS 2022, LNCS, Springer, 2022.</w:t>
+        <w:t>J. Nasiadka, W. Nitka y R. Weron, "Calibration window selection based on change-point detection for forecasting electricity prices," en Computational Science – ICCS 2022, LNCS, Springer, 2022, pp. 278–284.</w:t>
       </w:r>
     </w:p>
     <w:p>
@@ -1799,7 +1799,7 @@
           <w:color w:val="555555"/>
           <w:sz w:val="18"/>
         </w:rPr>
-        <w:t>arXiv:2204.00872</w:t>
+        <w:t>doi: 10.1007/978-3-031-08757-8_24 · arXiv:2204.00872</w:t>
         <w:br/>
       </w:r>
       <w:r>
@@ -1927,7 +1927,7 @@
         <w:tab/>
       </w:r>
       <w:r>
-        <w:t>A. Das y S. Schlüter, "Regime-aware conditional neural processes with multi-criteria decision support for operational electricity price forecasting," Energy Econ., vol. 157, art. 109233, 2026.</w:t>
+        <w:t>A. Das, S. Schlüter y L. Schneider, "Regime-aware conditional neural processes with multi-criteria decision support for operational electricity price forecasting," Energy Econ., vol. 157, art. 109233, 2026.</w:t>
       </w:r>
     </w:p>
     <w:p>
@@ -2001,7 +2001,7 @@
         <w:rPr>
           <w:sz w:val="19"/>
         </w:rPr>
-        <w:t>Marco del cambio de distribución 2026 frente a 2019-2025 (umbrales rodantes, reentrenamiento).</w:t>
+        <w:t>Cambio de distribución: respalda el método «rodante» (percentiles de una ventana móvil causal de 30 días sobre q50), que se adapta al régimen vigente.</w:t>
       </w:r>
     </w:p>
     <w:p>
@@ -2048,7 +2048,7 @@
         <w:rPr>
           <w:sz w:val="19"/>
         </w:rPr>
-        <w:t>Criterio maximin para elegir el método de umbral del motor (el peor semestre, no el promedio).</w:t>
+        <w:t>Criterio maximin: el método activo es el de mayor ventaja en la mitad más débil del periodo, no el de mayor promedio.</w:t>
       </w:r>
     </w:p>
     <w:p>
@@ -2095,7 +2095,7 @@
         <w:rPr>
           <w:sz w:val="19"/>
         </w:rPr>
-        <w:t>Marco formal de elegir entre varias reglas cuando el entorno cambia.</w:t>
+        <w:t>Trabajo futuro del informe: evaluar el criterio de estabilidad del motor con una formulación de bandits no estacionarios.</w:t>
       </w:r>
     </w:p>
     <w:p>
@@ -2111,7 +2111,7 @@
           <w:b/>
           <w:color w:val="B45309"/>
         </w:rPr>
-        <w:t>[L]</w:t>
+        <w:t>[S]</w:t>
         <w:tab/>
       </w:r>
       <w:r>
@@ -2142,7 +2142,7 @@
         <w:rPr>
           <w:sz w:val="19"/>
         </w:rPr>
-        <w:t>Aprendizaje con expertos; alternativa continua a la selección de método.</w:t>
+        <w:t>Lectura pendiente según la bitácora: aprendizaje con expertos, alternativa continua a la selección de método.</w:t>
       </w:r>
     </w:p>
     <w:p>
@@ -2205,11 +2205,11 @@
           <w:b/>
           <w:color w:val="B45309"/>
         </w:rPr>
-        <w:t>[L]</w:t>
+        <w:t>[S]</w:t>
         <w:tab/>
       </w:r>
       <w:r>
-        <w:t>R. I. Chang, C. H. Wang, L. C. Wei y Y. F. Lu, "LSTM with short-term bias compensation to determine trading strategy under black swan events of Taiwan ETF50 stock," Appl. Sci., vol. 14, art. 8576, 2024.</w:t>
+        <w:t>R. I. Chang, C. H. Wang, L. C. Wei y Y. F. Lu, "LSTM with short-term bias compensation to determine trading strategy under black swan events of Taiwan ETF50 stock," Appl. Sci., vol. 14, no. 18, art. 8576, 2024.</w:t>
       </w:r>
     </w:p>
     <w:p>
@@ -2236,7 +2236,7 @@
         <w:rPr>
           <w:sz w:val="19"/>
         </w:rPr>
-        <w:t>STBC original (λ fijo); conocido a través de Singh.</w:t>
+        <w:t>STBC original (λ fijo); conocido a través de Singh (no se leyó el original).</w:t>
       </w:r>
     </w:p>
     <w:p>
@@ -2283,7 +2283,7 @@
         <w:rPr>
           <w:sz w:val="19"/>
         </w:rPr>
-        <w:t>Pérdida de forma (DILATE) para atacar el amortiguamiento en las rampas.</w:t>
+        <w:t>Pérdida de forma DILATE, probada contra el amortiguamiento en las rampas: recupera la amplitud pero pasa el error a la forma (49 % del error cuadrático), así que no se adoptó.</w:t>
       </w:r>
     </w:p>
     <w:p>
@@ -2385,7 +2385,7 @@
         <w:rPr>
           <w:sz w:val="19"/>
         </w:rPr>
-        <w:t>Filtro de tendencia de la caracterización (OE1) y del filtro intradía del motor.</w:t>
+        <w:t>Tendencia de la caracterización (OE1): polinomio de orden 3 en ventanas de 721 h. Validado frente a Butterworth, Kalman, wavelet y promedio móvil en comparar_filtros_tendencia.py.</w:t>
       </w:r>
     </w:p>
     <w:p>
@@ -2432,7 +2432,7 @@
         <w:rPr>
           <w:sz w:val="19"/>
         </w:rPr>
-        <w:t>Fundamento de filtros FIR/IIR, fase cero y retardo de grupo.</w:t>
+        <w:t>Periodograma de la serie sin tendencia (Ecuación 6 del informe): identifica los periodos dominantes (fs = 1 muestra/h).</w:t>
       </w:r>
     </w:p>
     <w:p>
@@ -2675,7 +2675,7 @@
         <w:rPr>
           <w:sz w:val="19"/>
         </w:rPr>
-        <w:t>Comparación de MASE (Figura 5a). Ojo: transforman con Box-Cox y pronostican precio diario.</w:t>
+        <w:t>En el informe: ninguno de sus 33 modelos baja de MASE 1 (mejor 1,26), mientras Augur supera a su referencia ingenua en todos los años; se presenta como «superar al ingenuo en una tarea más difícil», no como comparación directa (transforman con Box-Cox y pronostican precio diario).</w:t>
       </w:r>
     </w:p>
     <w:p>
@@ -2832,11 +2832,11 @@
           <w:b/>
           <w:color w:val="B45309"/>
         </w:rPr>
-        <w:t>[V]</w:t>
+        <w:t>[L]</w:t>
         <w:tab/>
       </w:r>
       <w:r>
-        <w:t>Dias, Lira y Freire, "Methodology for multi-step forecasting of electricity spot prices based on neural networks applied to the Brazilian energy market," Energies, vol. 17, no. 8, art. 1864, 2024.</w:t>
+        <w:t>M. B. B. Dias, G. R. S. Lira y V. M. E. Freire, "Methodology for multi-step forecasting of electricity spot prices based on neural networks applied to the Brazilian energy market," Energies, vol. 17, no. 8, art. 1864, 2024.</w:t>
       </w:r>
     </w:p>
     <w:p>
@@ -2849,7 +2849,7 @@
           <w:color w:val="555555"/>
           <w:sz w:val="18"/>
         </w:rPr>
-        <w:t>https://www.mdpi.com/1996-1073/17/8/1864</w:t>
+        <w:t>doi: 10.3390/en17081864</w:t>
         <w:br/>
       </w:r>
       <w:r>
@@ -2863,7 +2863,7 @@
         <w:rPr>
           <w:sz w:val="19"/>
         </w:rPr>
-        <w:t>Poda por multicolinealidad (probada, no funciona) y referencia brasileña (Figura 5b). Nombres completos por verificar.</w:t>
+        <w:t>Poda por multicolinealidad: probada, no funciona y es riesgosa si se implementa literal; referencia brasileña de pronóstico multipaso.</w:t>
       </w:r>
     </w:p>
     <w:p>
@@ -2879,11 +2879,11 @@
           <w:b/>
           <w:color w:val="B45309"/>
         </w:rPr>
-        <w:t>[V]</w:t>
+        <w:t>[L]</w:t>
         <w:tab/>
       </w:r>
       <w:r>
-        <w:t>Nunes Jr., Ferreira y da Costa Pinho, "Information theoretic learning applied to daily streamflow forecast and its impact on the Brazilian hourly energy spot prices," J. Control Autom. Electr. Syst., 2024.</w:t>
+        <w:t>E. A. Nunes, V. H. Ferreira y A. da Costa Pinho, "Information theoretic learning applied to daily streamflow forecast and its impact on the Brazilian hourly energy spot prices," J. Control Autom. Electr. Syst., vol. 35, no. 5, pp. 949–959, 2024.</w:t>
       </w:r>
     </w:p>
     <w:p>
@@ -2896,7 +2896,7 @@
           <w:color w:val="555555"/>
           <w:sz w:val="18"/>
         </w:rPr>
-        <w:t>Volumen y páginas por verificar</w:t>
+        <w:t>doi: 10.1007/s40313-024-01110-z</w:t>
         <w:br/>
       </w:r>
       <w:r>
@@ -2926,11 +2926,11 @@
           <w:b/>
           <w:color w:val="B45309"/>
         </w:rPr>
-        <w:t>[V]</w:t>
+        <w:t>[L]</w:t>
         <w:tab/>
       </w:r>
       <w:r>
-        <w:t>Albani, Marcavillaca, Moreira et al., "Short-term forecasting of forward prices in the Brazilian electricity market with a hybrid stochastic-neural network model," Energy Econ., vol. 148, 2025.</w:t>
+        <w:t>V. V. L. Albani, R. T. Marcavillaca, P. S. E. Moreira et al., "Short-term forecasting of forward prices in the Brazilian electricity market with a hybrid stochastic-neural network model," Energy Econ., vol. 148, art. 108651, 2025.</w:t>
       </w:r>
     </w:p>
     <w:p>
@@ -2943,7 +2943,7 @@
           <w:color w:val="555555"/>
           <w:sz w:val="18"/>
         </w:rPr>
-        <w:t>Autores y páginas por verificar</w:t>
+        <w:t>doi: 10.1016/j.eneco.2025.108651</w:t>
         <w:br/>
       </w:r>
       <w:r>
@@ -3012,7 +3012,7 @@
         <w:rPr>
           <w:sz w:val="19"/>
         </w:rPr>
-        <w:t>Antecedente colombiano (NARX).</w:t>
+        <w:t>Antecedente colombiano (Tabla 4 del informe): red NARX con entradas exógenas, datos previos a 2015, sin incertidumbre.</w:t>
       </w:r>
     </w:p>
     <w:p>
@@ -3059,7 +3059,7 @@
         <w:rPr>
           <w:sz w:val="19"/>
         </w:rPr>
-        <w:t>Base del ARX+GARCH.</w:t>
+        <w:t>ARIMA con IGARCH: base del votante ARX+GARCH y antecedente colombiano (Tabla 4 del informe).</w:t>
       </w:r>
     </w:p>
     <w:p>
@@ -3106,7 +3106,7 @@
         <w:rPr>
           <w:sz w:val="19"/>
         </w:rPr>
-        <w:t>Antecedente colombiano directo.</w:t>
+        <w:t>Antecedente colombiano (Tabla 4): ARMAX, NARX e híbrido, mensual; con la prueba DM no hay diferencia significativa entre modelos.</w:t>
       </w:r>
     </w:p>
     <w:p>
@@ -3153,7 +3153,7 @@
         <w:rPr>
           <w:sz w:val="19"/>
         </w:rPr>
-        <w:t>Punto de referencia colombiano y enfoque funcional.</w:t>
+        <w:t>Antecedente colombiano horario (FPCA): su MAPE de 6,7 % a un día se compara con el 10,0 % de Augur, en un periodo calmo (2000-2017) y suponiendo conocido el precio del día anterior.</w:t>
       </w:r>
     </w:p>
     <w:p>
@@ -3357,11 +3357,11 @@
           <w:b/>
           <w:color w:val="B45309"/>
         </w:rPr>
-        <w:t>[V]</w:t>
+        <w:t>[L]</w:t>
         <w:tab/>
       </w:r>
       <w:r>
-        <w:t>L. Herrera-Mejía et al., artículo de AES Colombia sobre clasificación del régimen de oferta de plantas hidroeléctricas, Smart Energy (Elsevier), 2025.</w:t>
+        <w:t>L. Herrera-Mejía, C. D. Hoyos, D. La Rotta, Y. Mejía y J. Castillo, "Forecasting day-ahead hydropower bids in the Colombian electricity market: A two-stage machine learning framework," Smart Energy, vol. 21, art. 100221, 2026.</w:t>
       </w:r>
     </w:p>
     <w:p>
@@ -3374,7 +3374,7 @@
           <w:color w:val="555555"/>
           <w:sz w:val="18"/>
         </w:rPr>
-        <w:t>Título exacto por verificar</w:t>
+        <w:t>doi: 10.1016/j.segy.2025.100221</w:t>
         <w:br/>
       </w:r>
       <w:r>
@@ -3388,7 +3388,7 @@
         <w:rPr>
           <w:sz w:val="19"/>
         </w:rPr>
-        <w:t>Inspiró el clasificador de régimen alto + regresores por régimen.</w:t>
+        <w:t>Inspiró el clasificador de régimen alto (precio &gt; percentil 80) con regresores por régimen.</w:t>
       </w:r>
     </w:p>
     <w:p>
@@ -3435,7 +3435,7 @@
         <w:rPr>
           <w:sz w:val="19"/>
         </w:rPr>
-        <w:t>Contexto de la matriz y del mercado.</w:t>
+        <w:t>Matriz mayoritariamente hidroeléctrica: cerca del 72 % de la generación.</w:t>
       </w:r>
     </w:p>
     <w:p>
@@ -3482,7 +3482,7 @@
         <w:rPr>
           <w:sz w:val="19"/>
         </w:rPr>
-        <w:t>Participación hidroeléctrica (70-74 %).</w:t>
+        <w:t>Participación hidroeléctrica (70-74 %). Se citaba en un borrador anterior del informe; el final usa la IEA.</w:t>
       </w:r>
     </w:p>
     <w:p>
@@ -3537,7 +3537,7 @@
         <w:rPr>
           <w:sz w:val="19"/>
         </w:rPr>
-        <w:t>Despacho y predespacho.</w:t>
+        <w:t>Cierre de ofertas a las 08:00 de D-1: el pronóstico con predespacho sirve para decisiones posteriores (compras en bolsa, coberturas), no para formular ofertas.</w:t>
       </w:r>
     </w:p>
     <w:p>
@@ -3886,7 +3886,7 @@
         <w:tab/>
       </w:r>
       <w:r>
-        <w:t>CREG, "Resolución CREG 101 018 de 2022," Bogotá, 2022.</w:t>
+        <w:t>CREG, "Resolución CREG 101 018 de 2022, por la cual se crea el Sistema de Información del Mercado de Energía Mayorista, SIMEM," Bogotá, 2022.</w:t>
       </w:r>
     </w:p>
     <w:p>
@@ -3899,7 +3899,7 @@
           <w:color w:val="555555"/>
           <w:sz w:val="18"/>
         </w:rPr>
-        <w:t>gestornormativo.creg.gov.co</w:t>
+        <w:t>gestornormativo.creg.gov.co/gestor/entorno/docs/resolucion_creg_101-18_2022.htm</w:t>
         <w:br/>
       </w:r>
       <w:r>
@@ -3913,7 +3913,7 @@
         <w:rPr>
           <w:sz w:val="19"/>
         </w:rPr>
-        <w:t>Citada en el informe (marco regulatorio).</w:t>
+        <w:t>Crea el SIMEM: respalda el uso exclusivo de información pública de XM/SIMEM; el sistema no actúa como agente.</w:t>
       </w:r>
     </w:p>
     <w:p>
@@ -3933,7 +3933,7 @@
         <w:tab/>
       </w:r>
       <w:r>
-        <w:t>Congreso de Colombia, "Ley Estatutaria 1581 de 2012" (protección de datos personales).</w:t>
+        <w:t>Congreso de la República de Colombia, "Ley Estatutaria 1581 de 2012, por la cual se dictan disposiciones generales para la protección de datos personales," Bogotá, Colombia, oct. 2012.</w:t>
       </w:r>
     </w:p>
     <w:p>
@@ -3960,7 +3960,7 @@
         <w:rPr>
           <w:sz w:val="19"/>
         </w:rPr>
-        <w:t>Restricción de diseño: el proyecto solo usa datos públicos agregados.</w:t>
+        <w:t>Restricción de diseño: el dashboard no recolecta ni almacena datos personales.</w:t>
       </w:r>
     </w:p>
     <w:p>
@@ -4007,7 +4007,7 @@
         <w:rPr>
           <w:sz w:val="19"/>
         </w:rPr>
-        <w:t>Formato de fechas y horas de los contratos de datos.</w:t>
+        <w:t>Marcas de tiempo AAAA-MM-DD hh:mm:ss en hora legal de Colombia (UTC−5) para unir fuentes horarias, diarias y mensuales.</w:t>
       </w:r>
     </w:p>
     <w:p>
@@ -4054,7 +4054,7 @@
         <w:rPr>
           <w:sz w:val="19"/>
         </w:rPr>
-        <w:t>Criterios de calidad del dashboard.</w:t>
+        <w:t>Mantenibilidad: el motor lee el pronóstico por un contrato de datos (fuentes_pronostico.json) y no depende del modelo.</w:t>
       </w:r>
     </w:p>
     <w:p>
@@ -4074,7 +4074,7 @@
         <w:tab/>
       </w:r>
       <w:r>
-        <w:t>ACIEM y COPNIA, Manual de Referencia de Tarifas en Ingeniería, 2015.</w:t>
+        <w:t>ACIEM y Consejo Profesional Nacional de Ingenierías Eléctrica, Mecánica y Profesiones Afines, Manual de Referencia de Tarifas en Ingeniería. Cundinamarca, Colombia, 2015.</w:t>
       </w:r>
     </w:p>
     <w:p>
@@ -4101,7 +4101,7 @@
         <w:rPr>
           <w:sz w:val="19"/>
         </w:rPr>
-        <w:t>Estimación del costo del proyecto.</w:t>
+        <w:t>Honorarios del presupuesto del proyecto (Anexo 1).</w:t>
       </w:r>
     </w:p>
     <w:p>

</xml_diff>

<commit_message>
Referencias del Anexo 1 y del cambio regulatorio de 2015; bitacora del 23-oct
Co-Authored-By: Claude Opus 5.5 <noreply@anthropic.com>
</commit_message>
<xml_diff>
--- a/docs/Referencias_Augur_paper.docx
+++ b/docs/Referencias_Augur_paper.docx
@@ -3866,7 +3866,7 @@
         <w:rPr>
           <w:sz w:val="19"/>
         </w:rPr>
-        <w:t>Limitación: el PTB fue menor que el PBN en 360 horas de 2026.</w:t>
+        <w:t>Limitación: el PTB fue menor que el PBN en 360 horas de 2026. La 140 de 2017 (precio marginal de escasez, vigente desde el 1-dic-2017) es además el cambio permanente que justifica empezar la serie después de 2017: cambió la regla que activa la condición crítica y pone techo al precio que paga la demanda.</w:t>
       </w:r>
     </w:p>
     <w:p>
@@ -4446,7 +4446,391 @@
         <w:pStyle w:val="Heading1"/>
       </w:pPr>
       <w:r>
-        <w:t>9. Librerías de código abierto</w:t>
+        <w:t>9. Referencias del Anexo 1 (formulación) que no usa el informe final</w:t>
+      </w:r>
+    </w:p>
+    <w:p>
+      <w:pPr>
+        <w:tabs>
+          <w:tab w:pos="624" w:val="left"/>
+        </w:tabs>
+        <w:spacing w:after="20"/>
+        <w:ind w:left="624" w:hanging="624"/>
+      </w:pPr>
+      <w:r>
+        <w:rPr>
+          <w:b/>
+          <w:color w:val="B45309"/>
+        </w:rPr>
+        <w:t>[L]</w:t>
+        <w:tab/>
+      </w:r>
+      <w:r>
+        <w:t>Congreso de Colombia, "Ley 23 de 1982, sobre derechos de autor," Diario Oficial n.º 35.949, 19 de febrero de 1982.</w:t>
+      </w:r>
+    </w:p>
+    <w:p>
+      <w:pPr>
+        <w:spacing w:after="140"/>
+        <w:ind w:left="624"/>
+      </w:pPr>
+      <w:r>
+        <w:rPr>
+          <w:color w:val="555555"/>
+          <w:sz w:val="18"/>
+        </w:rPr>
+        <w:t>normas.cra.gov.co/gestor/docs/ley_0023_1982.htm</w:t>
+        <w:br/>
+      </w:r>
+      <w:r>
+        <w:rPr>
+          <w:b/>
+          <w:sz w:val="19"/>
+        </w:rPr>
+        <w:t xml:space="preserve">Uso en Augur: </w:t>
+      </w:r>
+      <w:r>
+        <w:rPr>
+          <w:sz w:val="19"/>
+        </w:rPr>
+        <w:t>Anexo 1, restricciones del diseño: propiedad intelectual del código, los datos y los materiales de terceros.</w:t>
+      </w:r>
+    </w:p>
+    <w:p>
+      <w:pPr>
+        <w:tabs>
+          <w:tab w:pos="624" w:val="left"/>
+        </w:tabs>
+        <w:spacing w:after="20"/>
+        <w:ind w:left="624" w:hanging="624"/>
+      </w:pPr>
+      <w:r>
+        <w:rPr>
+          <w:b/>
+          <w:color w:val="B45309"/>
+        </w:rPr>
+        <w:t>[L]</w:t>
+        <w:tab/>
+      </w:r>
+      <w:r>
+        <w:t>Comunidad Andina, "Decisión 351 de 1993: Régimen común sobre derecho de autor y derechos conexos," Lima, 1993.</w:t>
+      </w:r>
+    </w:p>
+    <w:p>
+      <w:pPr>
+        <w:spacing w:after="140"/>
+        <w:ind w:left="624"/>
+      </w:pPr>
+      <w:r>
+        <w:rPr>
+          <w:color w:val="555555"/>
+          <w:sz w:val="18"/>
+        </w:rPr>
+        <w:t>https://www.comunidadandina.org/StaticFiles/DocOf/DEC351.pdf</w:t>
+        <w:br/>
+      </w:r>
+      <w:r>
+        <w:rPr>
+          <w:b/>
+          <w:sz w:val="19"/>
+        </w:rPr>
+        <w:t xml:space="preserve">Uso en Augur: </w:t>
+      </w:r>
+      <w:r>
+        <w:rPr>
+          <w:sz w:val="19"/>
+        </w:rPr>
+        <w:t>Anexo 1, restricciones del diseño, junto con la Ley 23 de 1982.</w:t>
+      </w:r>
+    </w:p>
+    <w:p>
+      <w:pPr>
+        <w:tabs>
+          <w:tab w:pos="624" w:val="left"/>
+        </w:tabs>
+        <w:spacing w:after="20"/>
+        <w:ind w:left="624" w:hanging="624"/>
+      </w:pPr>
+      <w:r>
+        <w:rPr>
+          <w:b/>
+          <w:color w:val="B45309"/>
+        </w:rPr>
+        <w:t>[L]</w:t>
+        <w:tab/>
+      </w:r>
+      <w:r>
+        <w:t>ABET, "Criteria for Accrediting Engineering Programs, 2025–2026," Engineering Accreditation Commission, Baltimore, MD, EE. UU.</w:t>
+      </w:r>
+    </w:p>
+    <w:p>
+      <w:pPr>
+        <w:spacing w:after="140"/>
+        <w:ind w:left="624"/>
+      </w:pPr>
+      <w:r>
+        <w:rPr>
+          <w:color w:val="555555"/>
+          <w:sz w:val="18"/>
+        </w:rPr>
+        <w:t>https://www.abet.org/accreditation/accreditation-criteria/criteria-for-accrediting-engineering-programs-2025-2026/</w:t>
+        <w:br/>
+      </w:r>
+      <w:r>
+        <w:rPr>
+          <w:b/>
+          <w:sz w:val="19"/>
+        </w:rPr>
+        <w:t xml:space="preserve">Uso en Augur: </w:t>
+      </w:r>
+      <w:r>
+        <w:rPr>
+          <w:sz w:val="19"/>
+        </w:rPr>
+        <w:t>Resultado SO2 (diseño en ingeniería): ítem 6 del Anexo 1 y estructura del informe final ABET.</w:t>
+      </w:r>
+    </w:p>
+    <w:p>
+      <w:pPr>
+        <w:tabs>
+          <w:tab w:pos="624" w:val="left"/>
+        </w:tabs>
+        <w:spacing w:after="20"/>
+        <w:ind w:left="624" w:hanging="624"/>
+      </w:pPr>
+      <w:r>
+        <w:rPr>
+          <w:b/>
+          <w:color w:val="B45309"/>
+        </w:rPr>
+        <w:t>[L]</w:t>
+        <w:tab/>
+      </w:r>
+      <w:r>
+        <w:t>CREG, "Resolución CREG 178 de 2015, por la cual se establecen medidas para garantizar la prestación del servicio público de energía eléctrica," Bogotá, 27 de octubre de 2015.</w:t>
+      </w:r>
+    </w:p>
+    <w:p>
+      <w:pPr>
+        <w:spacing w:after="140"/>
+        <w:ind w:left="624"/>
+      </w:pPr>
+      <w:r>
+        <w:rPr>
+          <w:color w:val="555555"/>
+          <w:sz w:val="18"/>
+        </w:rPr>
+        <w:t>gestornormativo.creg.gov.co/gestor/entorno/docs/resolucion_creg_0178_2015.htm</w:t>
+        <w:br/>
+      </w:r>
+      <w:r>
+        <w:rPr>
+          <w:b/>
+          <w:sz w:val="19"/>
+        </w:rPr>
+        <w:t xml:space="preserve">Uso en Augur: </w:t>
+      </w:r>
+      <w:r>
+        <w:rPr>
+          <w:sz w:val="19"/>
+        </w:rPr>
+        <w:t>El «cambio regulatorio de 2015» del Anexo 1, parte transitoria: durante El Niño 2015-2016 fijó un piso al precio de escasez y una opción para térmicas a combustibles líquidos, por seis meses (la Res. 052 de 2016 no la prorrogó). Justifica excluir 2015-2016: el mercado operó con reglas de excepción.</w:t>
+      </w:r>
+    </w:p>
+    <w:p>
+      <w:pPr>
+        <w:tabs>
+          <w:tab w:pos="624" w:val="left"/>
+        </w:tabs>
+        <w:spacing w:after="20"/>
+        <w:ind w:left="624" w:hanging="624"/>
+      </w:pPr>
+      <w:r>
+        <w:rPr>
+          <w:b/>
+          <w:color w:val="B45309"/>
+        </w:rPr>
+        <w:t>[L]</w:t>
+        <w:tab/>
+      </w:r>
+      <w:r>
+        <w:t>P. Villegas y H. A. Gómez, "Medidas regulatorias posteriores a los fenómenos de El Niño 2015-2016 y 2023-2024 en Colombia, una mirada desde la confiabilidad," en XX ERIAC, CIGRE, Ciudad del Este, Paraguay, mayo de 2025.</w:t>
+      </w:r>
+    </w:p>
+    <w:p>
+      <w:pPr>
+        <w:spacing w:after="140"/>
+        <w:ind w:left="624"/>
+      </w:pPr>
+      <w:r>
+        <w:rPr>
+          <w:color w:val="555555"/>
+          <w:sz w:val="18"/>
+        </w:rPr>
+        <w:t>xm.com.co (Paper N.º 48, Comité C5)</w:t>
+        <w:br/>
+      </w:r>
+      <w:r>
+        <w:rPr>
+          <w:b/>
+          <w:sz w:val="19"/>
+        </w:rPr>
+        <w:t xml:space="preserve">Uso en Augur: </w:t>
+      </w:r>
+      <w:r>
+        <w:rPr>
+          <w:sz w:val="19"/>
+        </w:rPr>
+        <w:t>Fuente secundaria sobre los cambios al precio de escasez tras El Niño 2015-2016: en ese periodo el precio de bolsa superó el precio de escasez el 61,4 % de los días (hasta 2.821 COP/kWh), y el PME rige desde el 1-dic-2017. Cautela: atribuye a la Res. CREG 088 de 2016 un ajuste del precio de escasez, pero esa resolución trata de la oferta de GLP; no citarla.</w:t>
+      </w:r>
+    </w:p>
+    <w:p>
+      <w:pPr>
+        <w:tabs>
+          <w:tab w:pos="624" w:val="left"/>
+        </w:tabs>
+        <w:spacing w:after="20"/>
+        <w:ind w:left="624" w:hanging="624"/>
+      </w:pPr>
+      <w:r>
+        <w:rPr>
+          <w:b/>
+          <w:color w:val="B45309"/>
+        </w:rPr>
+        <w:t>[L]</w:t>
+        <w:tab/>
+      </w:r>
+      <w:r>
+        <w:t>Globalsyde, "Software para comercializadoras de energía" (plataforma en la nube), España.</w:t>
+      </w:r>
+    </w:p>
+    <w:p>
+      <w:pPr>
+        <w:spacing w:after="140"/>
+        <w:ind w:left="624"/>
+      </w:pPr>
+      <w:r>
+        <w:rPr>
+          <w:color w:val="555555"/>
+          <w:sz w:val="18"/>
+        </w:rPr>
+        <w:t>https://globalsyde.com</w:t>
+        <w:br/>
+      </w:r>
+      <w:r>
+        <w:rPr>
+          <w:b/>
+          <w:sz w:val="19"/>
+        </w:rPr>
+        <w:t xml:space="preserve">Uso en Augur: </w:t>
+      </w:r>
+      <w:r>
+        <w:rPr>
+          <w:sz w:val="19"/>
+        </w:rPr>
+        <w:t>Anexo 1, justificación (2): herramienta comercial para comercializadoras minoristas españolas (contratación, tarificación y facturación), que no aplica al mercado mayorista colombiano.</w:t>
+      </w:r>
+    </w:p>
+    <w:p>
+      <w:pPr>
+        <w:tabs>
+          <w:tab w:pos="624" w:val="left"/>
+        </w:tabs>
+        <w:spacing w:after="20"/>
+        <w:ind w:left="624" w:hanging="624"/>
+      </w:pPr>
+      <w:r>
+        <w:rPr>
+          <w:b/>
+          <w:color w:val="B45309"/>
+        </w:rPr>
+        <w:t>[L]</w:t>
+        <w:tab/>
+      </w:r>
+      <w:r>
+        <w:t>Enexpa, "Servicios para comercializadoras de electricidad y gas en España".</w:t>
+      </w:r>
+    </w:p>
+    <w:p>
+      <w:pPr>
+        <w:spacing w:after="140"/>
+        <w:ind w:left="624"/>
+      </w:pPr>
+      <w:r>
+        <w:rPr>
+          <w:color w:val="555555"/>
+          <w:sz w:val="18"/>
+        </w:rPr>
+        <w:t>https://www.enexpa.es</w:t>
+        <w:br/>
+      </w:r>
+      <w:r>
+        <w:rPr>
+          <w:b/>
+          <w:sz w:val="19"/>
+        </w:rPr>
+        <w:t xml:space="preserve">Uso en Augur: </w:t>
+      </w:r>
+      <w:r>
+        <w:rPr>
+          <w:sz w:val="19"/>
+        </w:rPr>
+        <w:t>Anexo 1, justificación (2), por la misma razón que Globalsyde.</w:t>
+      </w:r>
+    </w:p>
+    <w:p>
+      <w:pPr>
+        <w:tabs>
+          <w:tab w:pos="624" w:val="left"/>
+        </w:tabs>
+        <w:spacing w:after="20"/>
+        <w:ind w:left="624" w:hanging="624"/>
+      </w:pPr>
+      <w:r>
+        <w:rPr>
+          <w:b/>
+          <w:color w:val="B45309"/>
+        </w:rPr>
+        <w:t>[V]</w:t>
+        <w:tab/>
+      </w:r>
+      <w:r>
+        <w:t>SIGE Comercialización, ERP para comercializadoras y distribuidoras de electricidad y gas, España.</w:t>
+      </w:r>
+    </w:p>
+    <w:p>
+      <w:pPr>
+        <w:spacing w:after="140"/>
+        <w:ind w:left="624"/>
+      </w:pPr>
+      <w:r>
+        <w:rPr>
+          <w:color w:val="555555"/>
+          <w:sz w:val="18"/>
+        </w:rPr>
+        <w:t>asest.es/story/sige-erp-electridad-gas/</w:t>
+        <w:br/>
+      </w:r>
+      <w:r>
+        <w:rPr>
+          <w:b/>
+          <w:sz w:val="19"/>
+        </w:rPr>
+        <w:t xml:space="preserve">Uso en Augur: </w:t>
+      </w:r>
+      <w:r>
+        <w:rPr>
+          <w:sz w:val="19"/>
+        </w:rPr>
+        <w:t>Anexo 1, justificación (2). Fabricante y página oficial sin confirmar (un directorio lo atribuye a Grupo Audinfor).</w:t>
+      </w:r>
+    </w:p>
+    <w:p>
+      <w:pPr>
+        <w:pStyle w:val="Heading1"/>
+      </w:pPr>
+      <w:r>
+        <w:t>10. Librerías de código abierto</w:t>
       </w:r>
     </w:p>
     <w:p>
@@ -6404,7 +6788,7 @@
         <w:pStyle w:val="Heading1"/>
       </w:pPr>
       <w:r>
-        <w:t>10. Herramientas e infraestructura</w:t>
+        <w:t>11. Herramientas e infraestructura</w:t>
       </w:r>
     </w:p>
     <w:p>
@@ -6594,7 +6978,7 @@
         <w:pStyle w:val="Heading1"/>
       </w:pPr>
       <w:r>
-        <w:t>11. Material propio del proyecto (para citar o anexar)</w:t>
+        <w:t>12. Material propio del proyecto (para citar o anexar)</w:t>
       </w:r>
     </w:p>
     <w:p>
@@ -6704,7 +7088,7 @@
           <w:color w:val="555555"/>
           <w:sz w:val="18"/>
         </w:rPr>
-        <w:t>91 referencias bibliográficas, regulatorias y de datos · 24 librerías · 13 herramientas</w:t>
+        <w:t>99 referencias bibliográficas, regulatorias y de datos · 24 librerías · 13 herramientas</w:t>
       </w:r>
     </w:p>
     <w:sectPr>

</xml_diff>